<commit_message>
Add local session history search
</commit_message>
<xml_diff>
--- a/Instructions.docx
+++ b/Instructions.docx
@@ -32,7 +32,7 @@
     </w:p>
     <w:p>
       <w:r>
-        <w:t>A right-hand sidebar for the OpenCode desktop app. It shows live session telemetry: context-window usage, session cost, generation speed, cache hit ratio, MCP usage, your OpenCode Go and OpenAI subscription caps (5-hour, weekly, monthly), and an estimated per-model share of each Go cap window.</w:t>
+        <w:t>A right-hand sidebar for the OpenCode desktop app. It shows live session telemetry: context-window usage, session cost, generation speed, cache hit ratio, MCP usage, your OpenCode Go and OpenAI subscription caps (5-hour, weekly, monthly), and an estimated per-model share of each Go cap window. A Search button beside it finds text across every past session.</w:t>
       </w:r>
     </w:p>
     <w:p>
@@ -89,6 +89,14 @@
       </w:pPr>
       <w:r>
         <w:t>Estimated per-model share of each Go cap window.</w:t>
+      </w:r>
+    </w:p>
+    <w:p>
+      <w:pPr>
+        <w:pStyle w:val="ListBullet"/>
+      </w:pPr>
+      <w:r>
+        <w:t>History search over user prompts and agent replies, opening hits as new tabs.</w:t>
       </w:r>
     </w:p>
     <w:p>
@@ -170,7 +178,7 @@
     </w:p>
     <w:p>
       <w:r>
-        <w:t>You should see a Telemetry button at the bottom-right of the window. The sidebar is open by default; click the button (or press Escape while it has focus) to collapse it. The first refresh can take a few seconds while the session loads.</w:t>
+        <w:t>You should see a Telemetry button at the bottom-right of the window, with a Search button beside it. The sidebar is open by default; click the button (or press Escape while it has focus) to collapse it. The first refresh can take a few seconds while the session loads.</w:t>
       </w:r>
     </w:p>
     <w:p>
@@ -376,6 +384,51 @@
           <w:sz w:val="18"/>
         </w:rPr>
         <w:t>OpenAI caps, model token share and diagnostics</w:t>
+      </w:r>
+    </w:p>
+    <w:p>
+      <w:pPr>
+        <w:pStyle w:val="Heading1"/>
+      </w:pPr>
+      <w:r>
+        <w:t>Search</w:t>
+      </w:r>
+    </w:p>
+    <w:p>
+      <w:r>
+        <w:t>The Search button next to Telemetry searches the text of every session stored by OpenCode — user prompts and agent replies — and opens any hit as an additional session tab, leaving your open sessions untouched.</w:t>
+      </w:r>
+    </w:p>
+    <w:p>
+      <w:pPr>
+        <w:pStyle w:val="ListBullet"/>
+      </w:pPr>
+      <w:r>
+        <w:t>The User and Agent checkboxes choose which roles are searched (both on by default).</w:t>
+      </w:r>
+    </w:p>
+    <w:p>
+      <w:pPr>
+        <w:pStyle w:val="ListBullet"/>
+      </w:pPr>
+      <w:r>
+        <w:t>The dropdown caps the number of results; an empty query lists the most recent messages.</w:t>
+      </w:r>
+    </w:p>
+    <w:p>
+      <w:pPr>
+        <w:pStyle w:val="ListBullet"/>
+      </w:pPr>
+      <w:r>
+        <w:t>Hover a result for a wider context window; reasoning and tool calls are never searched.</w:t>
+      </w:r>
+    </w:p>
+    <w:p>
+      <w:pPr>
+        <w:pStyle w:val="ListBullet"/>
+      </w:pPr>
+      <w:r>
+        <w:t>Text is escaped before rendering, the database is only ever read, and a search that finds nothing does not slow the app down: typing again cancels the previous search.</w:t>
       </w:r>
     </w:p>
     <w:p>

</xml_diff>

<commit_message>
Regenerate the guide for 1.2.0: optional Claude login setup
</commit_message>
<xml_diff>
--- a/Instructions.docx
+++ b/Instructions.docx
@@ -32,7 +32,7 @@
     </w:p>
     <w:p>
       <w:r>
-        <w:t>A right-hand sidebar for the OpenCode desktop app. It shows live session telemetry: context-window usage, session cost, generation speed, cache hit ratio, MCP usage, your OpenCode Go and OpenAI subscription caps (5-hour, weekly, monthly), and an estimated per-model share of each Go cap window. A Search button beside it finds text across every past session.</w:t>
+        <w:t>A right-hand sidebar for the OpenCode desktop app. It shows live session telemetry: context-window usage, session cost, generation speed, cache hit ratio, MCP usage, your OpenCode Go and OpenAI subscription caps (5-hour, weekly, monthly), optionally your Anthropic (Claude) 5-hour and weekly limits, and an estimated per-model share of each Go cap window. A Search button beside it finds text across every past session.</w:t>
       </w:r>
     </w:p>
     <w:p>
@@ -81,6 +81,14 @@
       </w:pPr>
       <w:r>
         <w:t>OpenCode Go and OpenAI caps with reset times and remaining percent.</w:t>
+      </w:r>
+    </w:p>
+    <w:p>
+      <w:pPr>
+        <w:pStyle w:val="ListBullet"/>
+      </w:pPr>
+      <w:r>
+        <w:t>Optional: Anthropic (Claude) 5-hour and weekly limits, from a Claude login you point the sidebar at.</w:t>
       </w:r>
     </w:p>
     <w:p>
@@ -436,6 +444,59 @@
         <w:pStyle w:val="Heading1"/>
       </w:pPr>
       <w:r>
+        <w:t>Anthropic (Claude) limits (optional)</w:t>
+      </w:r>
+    </w:p>
+    <w:p>
+      <w:r>
+        <w:t>An Anthropic section shows your Claude subscription’s 5-hour and weekly limits as used and remaining percent with reset times. It is off until you switch it on, because OpenCode holds only an API key (or a local proxy’s key) for Anthropic, and neither can read subscription limits. The sidebar needs the Claude login instead.</w:t>
+      </w:r>
+    </w:p>
+    <w:p>
+      <w:pPr>
+        <w:pStyle w:val="ListNumber"/>
+      </w:pPr>
+      <w:r>
+        <w:t>Create %USERPROFILE%\.config\opencode\local-telemetry.json containing { "anthropic": { "credentialPath": "C:/path/to/your/claude/login" } }. The path is one login file, or a folder of claude-*.json files.</w:t>
+      </w:r>
+    </w:p>
+    <w:p>
+      <w:pPr>
+        <w:pStyle w:val="ListNumber"/>
+      </w:pPr>
+      <w:r>
+        <w:t>Within a minute the Anthropic section appears after the other caps. No restart is needed once this version is installed.</w:t>
+      </w:r>
+    </w:p>
+    <w:p>
+      <w:pPr>
+        <w:pStyle w:val="ListBullet"/>
+      </w:pPr>
+      <w:r>
+        <w:t>The login file is only read, never written, and its token is sent only to Anthropic’s usage endpoint. The sidebar receives percentages and reset times only.</w:t>
+      </w:r>
+    </w:p>
+    <w:p>
+      <w:pPr>
+        <w:pStyle w:val="ListBullet"/>
+      </w:pPr>
+      <w:r>
+        <w:t>The endpoint is undocumented and rate-limited, so it refreshes every 5 minutes; if it fails, the last reading stays on screen labelled Stale.</w:t>
+      </w:r>
+    </w:p>
+    <w:p>
+      <w:pPr>
+        <w:pStyle w:val="ListBullet"/>
+      </w:pPr>
+      <w:r>
+        <w:t>It needs a Claude subscription login; API keys have no caps. Whether a third-party tool may use your subscription login is governed by Anthropic’s terms.</w:t>
+      </w:r>
+    </w:p>
+    <w:p>
+      <w:pPr>
+        <w:pStyle w:val="Heading1"/>
+      </w:pPr>
+      <w:r>
         <w:t>Reading the numbers honestly</w:t>
       </w:r>
     </w:p>
@@ -577,7 +638,7 @@
         <w:pStyle w:val="ListBullet"/>
       </w:pPr>
       <w:r>
-        <w:t>Nothing is uploaded anywhere. The only network requests are to the two provider usage endpoints.</w:t>
+        <w:t>Nothing is uploaded anywhere. The only network requests are to the providers’ own usage endpoints (Anthropic’s only if you enable it).</w:t>
       </w:r>
     </w:p>
     <w:sectPr>

</xml_diff>